<commit_message>
Add/update resource data for UWTranslationQuestions
</commit_message>
<xml_diff>
--- a/arb/docx/01.content.docx
+++ b/arb/docx/01.content.docx
@@ -147,13 +147,6 @@
         <w:rPr>
           <w:lang w:val="ar_AE" w:bidi="ar_AE"/>
         </w:rPr>
-      </w:r>
-      <w:r>
-        <w:rPr>
-          <w:i/>
-          <w:lang w:val="ar_AE" w:bidi="ar_AE"/>
-        </w:rPr>
-        <w:t>التكوين 1: 1, التكوين 1: 2, تكوين ١: ٣, التكوين ١: ٧–٨, تكوين 1: 10, التكوين ١: ١١–١٢, التكوين 1: 14, تكوين 1: 16, تكوين 1: 21, التكوين 1:22, التكوين 1: 26, التكوين 1: 26 (#2), تكوين 1: 27, التكوين 1: 28, التكوين 1: 29, تكوين 1: 31, التكوين ٢: ٢–٣, التكوين ٢: ٦, التكوين 2: 7, التكوين 2: 8, تكوين 2: 9, التكوين 2: 15, التكوين 2: 16–17, التكوين 2: 17, التكوين 2: 18, تكوين 2: 19, التكوين 2: 20, التكوين 2: 22, التكوين 2: 23, تكوين 2: 24, تكوين ٢: ٢٥, تكوين 3: 1, تكوين 3: 4, التكوين 3: 5, تكوين 3: 6, التكوين 3: 6 (#2), تكوين 3: 7, التكوين 3: 8, تكوين ٣: ١٠, التكوين 3: 12, تكوين 3: 13, تكوين 3: 15, التكوين 3: 16, التكوين 3: 17, تكوين 3: 20, تكوين 3: 21, التكوين 3: 22, تكوين 3: 24, تكوين 4: 2, تكوين 4: 3, تكوين 4: 4, تكوين 4: 4–5, تكوين 4: 5, تكوين 4: 7, تكوين 4: 8, تكوين 4: 9, تكوين 4: 12, تكوين 4: 15, تكوين 4: 16, تكوين 4: 19, تكوين 4: 23, تكوين 4: 25, تكوين 4: 26, تكوين 5: 1, تكوين 5: 1 (#2), التكوين 5: 2, تكوين 5: 5, تكوين 5: 8, تكوين 5: 14, التكوين 5: 20, تكوين 5: 24, تكوين 5: 29, تكوين ٥: ٣٢, تكوين ٦: ٢, تكوين 6: 3, تكوين 6: 4, تكوين 6: 5, تكوين 6: 7, التكوين 6: 8, تكوين 6: 9, تكوين 6: 14, تكوين 6: 17, التكوين 6: 18, تكوين 6: 18 (#2), التكوين 6: 19, تكوين 6: 22, تكوين ٧: ٢, التكوين 7: 4, تكوين ٧: ٦, التكوين 7: 9, تكوين ٧: ١١, تكوين 7: 16, تكوين ٧: ٢٠, تكوين 7: 21, تكوين ٧: ٢٣, تكوين ٨: ١–٢, تكوين 8: 4, التكوين 8: 9, تكوين 8: 11, تكوين 8: 12, تكوين ٨: ١٣, تكوين ٨: ١٧, تكوين 8: 20, تكوين 8: 21, التكوين 8: 21 (#2), تكوين 9: 1, تكوين 9: 3, تكوين 9: 4, تكوين 9: 4 (#2), تكوين 9: 5–6, تكوين 9: 6, التكوين 9: 9–11, تكوين 9: 13, تكوين 9: 15, تكوين 9: 16–17, التكوين 9: 18, تكوين 9: 20–21, تكوين 9: 23, تكوين 9: 25, التكوين 9: 26–27, التكوين 10: 5, تكوين 10: 9, تكوين 10: 10, التكوين 10:11, تكوين ١٠: ١٥, تكوين 10: 20, تكوين 10: 25, تكوين 10: 31, تكوين 10: 32, تكوين 11: 1, تكوين 11: 2, تكوين 11: 4, تكوين 11: 4 (#2), تكوين 11: 7, تكوين 11: 7 (#2), تكوين 11: 8, تكوين 11: 9, تكوين ١١: ١٠, تكوين 11: 26, تكوين 11: 27, تكوين 11: 28, تكوين 11: 29, تكوين 11: 30, تكوين 11: 31, تكوين ١٢: ١, التكوين 12: 2–3, تكوين 12: 5, التكوين 12: 5 (#2), تكوين 12: 7, تكوين 12: 8, تكوين ١٢: ١٠, تكوين ١٢: ١٢, تكوين 12: 13, تكوين 12: 15, تكوين ١٢: ١٧, التكوين ١٢: ١٨–١٩, تكوين 12: 20, تكوين 13: 1, تكوين 13: 2, تكوين 13: 6–7, التكوين 13: 9, التكوين ١٣: ١٠–١١, تكوين 13: 12, تكوين 13: 13, تكوين 13: 14–15, تكوين 13:16, تكوين 13: 18, تكوين ١٤: ١١–١٢, تكوين 14: 14, تكوين ١٤: ١٥–١٦, تكوين 14: 17–18, تكوين 14: 18, تكوين 14: 18 (#2), تكوين ١٤: ١٩–٢٠, تكوين 14: 20, تكوين 14: 21, تكوين 14: 22–23, تكوين 14: 23–24, تكوين ١٥: ١, التكوين 15: 2–3, تكوين 15: 4, تكوين 15: 5, تكوين 15: 6, التكوين 15: 8, تكوين 15: 10, تكوين 15: 12, تكوين ١٥: ١٣, التكوين 15: 14, التكوين 15: 15, التكوين 15: 16, تكوين 15: 17, تكوين 15: 18–21, التكوين ١٦: ١–٢, تكوين 16: 4, تكوين ١٦: ٥–٦, تكوين 16: 6, تكوين 16: 9, التكوين ١٦: ١٠, تكوين 16: 11, التكوين 16: 12, تكوين 16: 13, تكوين 16: 16, تكوين 17: 1, تكوين 17:1 (#2), تكوين 17: 5, تكوين 17: 8, التكوين 17: 8 (#2), تكوين 17: 10–11, تكوين ١٧: ١٢, تكوين ١٧: ١٢–١٣, تكوين 17: 14, تكوين 17: 15, التكوين 17: 16, التكوين 17: 17, تكوين 17: 19, التكوين 17: 19 (#2), تكوين 17: 20, تكوين 17: 21, تكوين 17: 24–27, تكوين 17: 25, تكوين 18: 2, التكوين 18: 4–5, التكوين 18: 9, تكوين 18: 10, التكوين 18: 12, تكوين 18: 14, التكوين 18: 16, تكوين 18: 17, التكوين 18: 19, تكوين 18: 20–21, التكوين 18: 23, التكوين 18: 26, التكوين 18: 28, التكوين 18: 29, التكوين 18: 30, التكوين 18: 31, التكوين 18: 32, تكوين 19: 2, تكوين 19: 2 (#2), تكوين 19: 3, تكوين 19: 5, تكوين 19: 8, تكوين 19: 9, تكوين 19: 11, التكوين 19: 13, تكوين 19: 14, تكوين 19: 15, تكوين 19: 16, تكوين 19: 17, التكوين 19: 22, تكوين 19: 24, تكوين 19: 26, تكوين 19: 28, تكوين 19: 30, التكوين 19: 31–32, تكوين 19: 37–38, التكوين 20: 1–2, التكوين 20: 3, تكوين 20: 5, التكوين 20: 7, تكوين 20: 8, التكوين 20: 11, تكوين 20: 12, التكوين 20: 16, تكوين 20: 16 (#2), تكوين 20: 17, التكوين ٢١: ٢, التكوين 21: 4, التكوين 21: 6, التكوين 21: 9, تكوين 21: 10, التكوين 21:11, التكوين 21: 12, تكوين 21: 14, التكوين 21: 18, التكوين 21: 19, التكوين 21: 20–21, التكوين 21: 23, التكوين 21: 25, التكوين 21: 28–30, التكوين 21: 32, تكوين 21: 33, التكوين 21: 34, التكوين 22: 1–2, تكوين 22: 3, التكوين 22: 5, تكوين 22: 7, التكوين 22: 8, التكوين 22: 9, تكوين 22: 12, التكوين 22: 12 (#2), تكوين 22: 13, التكوين 22: 14, التكوين 22: 16–17, التكوين 22: 18, تكوين ٢٣: ٢, تكوين 23: 3–4, تكوين 23: 5–6, تكوين 23: 10–11, تكوين 23: 12–13, تكوين 23: 14–15, تكوين 23: 14–16, التكوين 23: 17–18, التكوين 23: 19, التكوين ٢٤: ٢–٤, تكوين ٢٤: ٥–٦, التكوين 24: 12–14, التكوين 24: 15, تكوين ٢٤: ١٧–١٨, التكوين 24: 19, التكوين 24: 26–27, التكوين 24: 29, تكوين 24: 31, التكوين 24: 33, تكوين 24: 40, تكوين 24: 47, تكوين ٢٤: ٥٠–٥١, التكوين 24: 52–53, تكوين ٢٤: ٥٤–٥٥, التكوين 24: 56–58, تكوين 24: 60, تكوين 24: 63, التكوين 24: 64–65, تكوين 24: 67, تكوين 25: 1, تكوين ٢٥: ٥–٦, التكوين ٢٥: ٧, التكوين 25: 9, تكوين ٢٥: ١٨, التكوين 25: 21, تكوين 25: 23, تكوين ٢٥: ٢٥, التكوين 25: 26, تكوين ٢٥: ٢٧, التكوين ٢٥: ٢٧ (#٢), تكوين 25: 28, تكوين 25: 30, التكوين 25: 31, تكوين 25: 33, تكوين 25: 34, تكوين 26: 1, التكوين 26: 2, التكوين 26: 3, التكوين 26: 5, التكوين 26: 7, التكوين ٢٦: ٩–١٠, التكوين 26: 11, التكوين 26: 16, تكوين 26:18, التكوين 26: 22, تكوين ٢٦: ٢٣–٢٤, التكوين ٢٦: ٢٨–٢٩, التكوين 26: 30–31, تكوين 26: 34, التكوين ٢٦: ٣٥, التكوين 27: 1, التكوين 27: 3–4, التكوين ٢٧: ٨–١٠, تكوين ٢٧: ١١–١٢, التكوين 27: 15–16, تكوين 27: 20, التكوين ٢٧: ٢٢–٢٣, تكوين 27: 24, التكوين 27: 26–27, التكوين 27: 29, التكوين 27: 30–31, التكوين 27: 34–35, تكوين 27: 36, التكوين 27: 39–40, تكوين 27: 41, تكوين 27: 43, التكوين 28: 1, التكوين 28: 2, التكوين 28: 4, تكوين 28: 8–9, تكوين 28: 12–13, التكوين 28: 13, تكوين 28: 13 (#2), تكوين 28: 17, تكوين 28: 19, التكوين 28: 20–21, تكوين 28: 22, تكوين 29: 4, تكوين 29: 6, التكوين 29: 10, تكوين 29: 12, التكوين 29: 13, تكوين 29: 16–17, تكوين 29: 18, تكوين 29: 20, تكوين ٢٩: ٢٣–٢٥, تكوين ٢٩: ٢٤, التكوين 29: 26, تكوين 29: 27, تكوين 29: 29, تكوين 29: 31, تكوين 29: 32, تكوين 29: 32 (#2), تكوين 29: 35, التكوين 30: 2, التكوين 30: 3, التكوين 30: 7–8, التكوين 30: 9, التكوين 30: 10–11, تكوين 30: 14–15, التكوين 30: 20, التكوين 30: 23, التكوين 30: 25–26, تكوين 30: 27, التكوين 30: 32, التكوين ٣٠: ٣٥–٣٦, تكوين ٣٠: ٣٧, التكوين 30: 38, التكوين ٣٠: ٣٩, التكوين 30: 42, التكوين ٣١: ١–٢, تكوين ٣١: ٣, التكوين 31: 8–9, تكوين ٣١: ١٤–١٥, تكوين 31: 19, تكوين ٣١: ٢٠, تكوين ٣١: ٢٢–٢٣, تكوين ٣١: ٢٤, تكوين 31: 31, تكوين 31: 32, تكوين ٣١: ٣٤–٣٥, تكوين 31: 41, تكوين 31: 43, تكوين 31: 46, تكوين 31: 49–50, تكوين 31: 51–52, تكوين 31: 52, تكوين 31: 53, تكوين 31: 55, تكوين ٣٢: ٣, تكوين 32 :5, التكوين 32: 7–8, التكوين 32: 11, التكوين 32: 12, تكوين 32: 20, التكوين 32: 22, تكوين 32: 24, تكوين 32: 25, التكوين 32: 26, تكوين 32: 28, تكوين 32: 30, تكوين ٣٢: ٣٢, تكوين ٣٣: ٢–٣, تكوين ٣٣: ٣, تكوين 33: 4, التكوين ٣٣: ٩, التكوين 33: 11, التكوين 33: 12–14, التكوين 33: 14, تكوين 33: 17, التكوين 33: 18–19, التكوين ٣٤: ٢, تكوين 34: 5, تكوين ٣٤: ٧, التكوين 34: 8–9, التكوين 34: 12, تكوين 34: 13, تكوين 34: 15, تكوين 34: 23, التكوين ٣٤: ٢٤, التكوين 34: 25, التكوين 34: 27–29, التكوين ٣٤: ٣٠, تكوين ٣٤: ٣١, التكوين 35: 1, تكوين ٣٥: ٢, التكوين 35: 5, التكوين ٣٥: ٧, التكوين 35: 10, التكوين ٣٥: ١٢, التكوين 35: 18–19, التكوين 35: 22, التكوين 35: 22 (#2), تكوين 35: 24, تكوين 35: 28, تكوين 35: 29, التكوين 36: 1, تكوين 36: 2, التكوين 36: 6–7, التكوين 36: 8, التكوين 36: 12, التكوين 36: 15–16, التكوين 36: 20, تكوين 36: 31, تكوين 36: 43, تكوين ٣٧ :١, تكوين ٣٧: ٢, تكوين ٣٧: ٣, تكوين ٣٧: ٤, تكوين 37: 7, تكوين ٣٧: ٨, تكوين ٣٧: ٩, تكوين 37: 10, تكوين 37: 14, تكوين 37: 20, تكوين 37: 22, تكوين ٣٧: ٢٨, تكوين 37: 28 (#2), تكوين ٣٧: ٣١–٣٢, تكوين ٣٧: ٣٤, تكوين ٣٧: ٣٦, التكوين ٣٨: ٢, تكوين 38: 7, التكوين 38: 9, تكوين 38: 10, تكوين 38: 11, التكوين 38: 12, تكوين 38: 14, تكوين 38: 14 (#2), تكوين 38: 18, تكوين 38: 21, تكوين 38: 24, التكوين 38: 25, التكوين 38: 26, تكوين 38: 27, تكوين 38: 28, التكوين ٣٨: ٢٩–٣٠, تكوين 39: 1, تكوين ٣٩: ٣–٤, تكوين 39: 6, التكوين 39: 7, التكوين 39: 8–9, تكوين 39: 12, تكوين 39: 14–15, تكوين 39: 19–20, تكوين ٣٩: ٢١, تكوين ٣٩: ٢٢, تكوين ٣٩: ٢٣, التكوين 40: 1, تكوين 40: 5, تكوين 40: 7–8, تكوين 40: 8, التكوين 40: 12–13, تكوين 40: 14, تكوين 40: 18–19, تكوين 40: 20, تكوين 40: 21–22, تكوين 40: 23, تكوين ٤١: ٤, تكوين 41: 7, تكوين 41: 8, تكوين 41: 12–13, التكوين 41: 16, تكوين 41: 25, تكوين 41: 26, التكوين 41: 27, تكوين 41: 32, تكوين ٤١: ٣٤, تكوين 41: 38, تكوين ٤١: ٤٠–٤١, التكوين ٤١: ٤٨–٤٩, التكوين 41: 50–52, تكوين ٤١: ٥٤, تكوين 41: 55–56, تكوين 41: 57, تكوين ٤٢: ١–٤, تكوين 42: 6, تكوين 42: 7, تكوين 42: 9, تكوين ٤٢: ١٣, تكوين 42: 13 (#2), تكوين 42: 15, تكوين 42: 17, تكوين 42: 18–20, التكوين 42: 21–22, تكوين 42: 24, التكوين 42: 25, تكوين 42: 28, تكوين 42: 28 (#2), تكوين 42: 35, تكوين 42: 36, تكوين 42: 37, تكوين 42: 38, تكوين 42: 38 (#2), التكوين 43: 1–2, تكوين ٤٣: ٣–٥, تكوين 43: 9, تكوين 43: 11–12, تكوين 43: 14, تكوين 43: 18, التكوين 43: 21–22, تكوين ٤٣: ٢٣, تكوين 43: 26, تكوين 43: 27, تكوين 43: 30, تكوين 43: 32, تكوين 43: 33, التكوين 43: 34, تكوين 44: 1–2, تكوين ٤٤ : ٤–٥, تكوين ٤٤: ٩, تكوين 44: 10, تكوين 44: 12–13, تكوين 44: 14, تكوين 44: 16, تكوين 44: 16 (#2), التكوين 44: 17, التكوين 44: 20, تكوين 44: 22, التكوين ٤٤: ٢٣, تكوين ٤٤: ٢٦, تكوين 44: 28, تكوين 44: 29, تكوين 44: 31, تكوين 44: 32, تكوين 44: 33, التكوين ٤٥: ١–٢, تكوين 45: 3, تكوين ٤٥: ٧, تكوين 45: 8, تكوين ٤٥ : ٩–١١, تكوين ٤٥: ١٣, تكوين ٤٥: ١٦–١٨, تكوين ٤٥: ٢١–٢٣, تكوين 45: 26, التكوين 45: 28, تكوين 46: 1, التكوين ٤٦: ٣–٤, التكوين 46: 5–7, تكوين 46: 12, تكوين 46: 27, تكوين 46: 29, تكوين 46: 29 (#2), تكوين 46: 34, تكوين ٤٧: ٣, تكوين ٤٧:٤, تكوين ٤٧: ٦, تكوين 47: 7, تكوين ٤٧: ٩, تكوين ٤٧: ٩ (#٢), تكوين 47: 10, تكوين ٤٧: ١٤, تكوين ٤٧: ١٦–١٧, التكوين ٤٧: ١٨–١٩, تكوين ٤٧ :٢٤, تكوين ٤٧: ٢٧, التكوين ٤٧ :٢٨, تكوين 47: 30, التكوين 48: 1, التكوين 48: 4, تكوين 48: 5–6, التكوين 48: 8–10, تكوين 48: 14, تكوين 48: 14 (#2), تكوين 48: 17–18, تكوين 48: 19, تكوين 48: 20, تكوين 48: 21, تكوين 49: 1, تكوين 49: 3, تكوين ٤٩: ٤, تكوين 49: 7, تكوين 49: 8, تكوين 49: 10, تكوين 49: 13, تكوين 49: 17, تكوين 49: 20, تكوين 49: 22, تكوين 49: 24, التكوين 49: 31, تكوين 49: 33, تكوين 50: 2–3, التكوين 50: 4–6, تكوين 50: 7–9, التكوين 50: 11, تكوين 50: 14, تكوين 50: 15, تكوين 50: 17, التكوين 50: 18, تكوين 50: 20, تكوين 50: 22, التكوين 50: 24, تكوين 50: 24 (#2), تكوين 50: 25, تكوين 50: 26</w:t>
       </w:r>
       <w:r>
         <w:rPr>

</xml_diff>